<commit_message>
Refinado a geração do relatório para uma requisição.
</commit_message>
<xml_diff>
--- a/public/templates/template.docx
+++ b/public/templates/template.docx
@@ -1,6 +1,6 @@
 
 <file path=word/document.xml><?xml version="1.0" encoding="utf-8"?>
-<w:document xmlns:wpc="http://schemas.microsoft.com/office/word/2010/wordprocessingCanvas" xmlns:cx="http://schemas.microsoft.com/office/drawing/2014/chartex" xmlns:cx1="http://schemas.microsoft.com/office/drawing/2015/9/8/chartex" xmlns:cx2="http://schemas.microsoft.com/office/drawing/2015/10/21/chartex" xmlns:cx3="http://schemas.microsoft.com/office/drawing/2016/5/9/chartex" xmlns:cx4="http://schemas.microsoft.com/office/drawing/2016/5/10/chartex" xmlns:cx5="http://schemas.microsoft.com/office/drawing/2016/5/11/chartex" xmlns:cx6="http://schemas.microsoft.com/office/drawing/2016/5/12/chartex" xmlns:cx7="http://schemas.microsoft.com/office/drawing/2016/5/13/chartex" xmlns:cx8="http://schemas.microsoft.com/office/drawing/2016/5/14/chartex" xmlns:mc="http://schemas.openxmlformats.org/markup-compatibility/2006" xmlns:aink="http://schemas.microsoft.com/office/drawing/2016/ink" xmlns:am3d="http://schemas.microsoft.com/office/drawing/2017/model3d" xmlns:o="urn:schemas-microsoft-com:office:office" xmlns:oel="http://schemas.microsoft.com/office/2019/extlst" xmlns:r="http://schemas.openxmlformats.org/officeDocument/2006/relationships" xmlns:m="http://schemas.openxmlformats.org/officeDocument/2006/math" xmlns:v="urn:schemas-microsoft-com:vml" xmlns:wp14="http://schemas.microsoft.com/office/word/2010/wordprocessingDrawing" xmlns:wp="http://schemas.openxmlformats.org/drawingml/2006/wordprocessingDrawing" xmlns:w10="urn:schemas-microsoft-com:office:word" xmlns:w="http://schemas.openxmlformats.org/wordprocessingml/2006/main" xmlns:w14="http://schemas.microsoft.com/office/word/2010/wordml" xmlns:w15="http://schemas.microsoft.com/office/word/2012/wordml" xmlns:w16cex="http://schemas.microsoft.com/office/word/2018/wordml/cex" xmlns:w16cid="http://schemas.microsoft.com/office/word/2016/wordml/cid" xmlns:w16="http://schemas.microsoft.com/office/word/2018/wordml" xmlns:w16sdtdh="http://schemas.microsoft.com/office/word/2020/wordml/sdtdatahash" xmlns:w16se="http://schemas.microsoft.com/office/word/2015/wordml/symex" xmlns:wpg="http://schemas.microsoft.com/office/word/2010/wordprocessingGroup" xmlns:wpi="http://schemas.microsoft.com/office/word/2010/wordprocessingInk" xmlns:wne="http://schemas.microsoft.com/office/word/2006/wordml" xmlns:wps="http://schemas.microsoft.com/office/word/2010/wordprocessingShape" mc:Ignorable="w14 w15 w16se w16cid w16 w16cex w16sdtdh wp14">
+<w:document xmlns:wpc="http://schemas.microsoft.com/office/word/2010/wordprocessingCanvas" xmlns:cx="http://schemas.microsoft.com/office/drawing/2014/chartex" xmlns:cx1="http://schemas.microsoft.com/office/drawing/2015/9/8/chartex" xmlns:cx2="http://schemas.microsoft.com/office/drawing/2015/10/21/chartex" xmlns:cx3="http://schemas.microsoft.com/office/drawing/2016/5/9/chartex" xmlns:cx4="http://schemas.microsoft.com/office/drawing/2016/5/10/chartex" xmlns:cx5="http://schemas.microsoft.com/office/drawing/2016/5/11/chartex" xmlns:cx6="http://schemas.microsoft.com/office/drawing/2016/5/12/chartex" xmlns:cx7="http://schemas.microsoft.com/office/drawing/2016/5/13/chartex" xmlns:cx8="http://schemas.microsoft.com/office/drawing/2016/5/14/chartex" xmlns:mc="http://schemas.openxmlformats.org/markup-compatibility/2006" xmlns:aink="http://schemas.microsoft.com/office/drawing/2016/ink" xmlns:am3d="http://schemas.microsoft.com/office/drawing/2017/model3d" xmlns:o="urn:schemas-microsoft-com:office:office" xmlns:oel="http://schemas.microsoft.com/office/2019/extlst" xmlns:r="http://schemas.openxmlformats.org/officeDocument/2006/relationships" xmlns:m="http://schemas.openxmlformats.org/officeDocument/2006/math" xmlns:v="urn:schemas-microsoft-com:vml" xmlns:wp14="http://schemas.microsoft.com/office/word/2010/wordprocessingDrawing" xmlns:wp="http://schemas.openxmlformats.org/drawingml/2006/wordprocessingDrawing" xmlns:w10="urn:schemas-microsoft-com:office:word" xmlns:w="http://schemas.openxmlformats.org/wordprocessingml/2006/main" xmlns:w14="http://schemas.microsoft.com/office/word/2010/wordml" xmlns:w15="http://schemas.microsoft.com/office/word/2012/wordml" xmlns:w16cex="http://schemas.microsoft.com/office/word/2018/wordml/cex" xmlns:w16cid="http://schemas.microsoft.com/office/word/2016/wordml/cid" xmlns:w16="http://schemas.microsoft.com/office/word/2018/wordml" xmlns:w16du="http://schemas.microsoft.com/office/word/2023/wordml/word16du" xmlns:w16sdtdh="http://schemas.microsoft.com/office/word/2020/wordml/sdtdatahash" xmlns:w16sdtfl="http://schemas.microsoft.com/office/word/2024/wordml/sdtformatlock" xmlns:w16se="http://schemas.microsoft.com/office/word/2015/wordml/symex" xmlns:wpg="http://schemas.microsoft.com/office/word/2010/wordprocessingGroup" xmlns:wpi="http://schemas.microsoft.com/office/word/2010/wordprocessingInk" xmlns:wne="http://schemas.microsoft.com/office/word/2006/wordml" xmlns:wps="http://schemas.microsoft.com/office/word/2010/wordprocessingShape" mc:Ignorable="w14 w15 w16se w16cid w16 w16cex w16sdtdh w16sdtfl w16du wp14">
   <w:body>
     <w:p/>
     <w:p/>
@@ -11,8 +11,6 @@
     <w:p/>
     <w:p/>
     <w:p/>
-    <w:p/>
-    <w:p/>
     <w:p>
       <w:pPr>
         <w:jc w:val="center"/>
@@ -165,41 +163,20 @@
     </w:p>
     <w:p>
       <w:pPr>
-        <w:jc w:val="center"/>
         <w:rPr>
           <w:color w:val="2F5496"/>
           <w:sz w:val="44"/>
           <w:szCs w:val="44"/>
         </w:rPr>
       </w:pPr>
-    </w:p>
-    <w:p>
-      <w:pPr>
-        <w:jc w:val="center"/>
+      <w:r>
         <w:rPr>
           <w:color w:val="2F5496"/>
           <w:sz w:val="44"/>
           <w:szCs w:val="44"/>
         </w:rPr>
-      </w:pPr>
-    </w:p>
-    <w:p>
-      <w:pPr>
-        <w:rPr>
-          <w:color w:val="2F5496"/>
-          <w:sz w:val="44"/>
-          <w:szCs w:val="44"/>
-        </w:rPr>
-      </w:pPr>
-    </w:p>
-    <w:p>
-      <w:pPr>
-        <w:rPr>
-          <w:color w:val="2F5496"/>
-          <w:sz w:val="44"/>
-          <w:szCs w:val="44"/>
-        </w:rPr>
-      </w:pPr>
+        <w:br w:type="page"/>
+      </w:r>
     </w:p>
     <w:p>
       <w:pPr>
@@ -229,6 +206,7 @@
           <w:sz w:val="28"/>
           <w:szCs w:val="28"/>
         </w:rPr>
+        <w:lastRenderedPageBreak/>
         <w:t>INFORMAÇÕES DE CONTRATO:</w:t>
       </w:r>
     </w:p>
@@ -272,7 +250,7 @@
     </w:p>
     <w:p>
       <w:pPr>
-        <w:ind w:hanging="2"/>
+        <w:ind w:firstLine="360"/>
         <w:jc w:val="both"/>
         <w:rPr>
           <w:rFonts w:ascii="Arial" w:eastAsia="Arial" w:hAnsi="Arial" w:cs="Arial"/>
@@ -286,25 +264,7 @@
           <w:sz w:val="24"/>
           <w:szCs w:val="24"/>
         </w:rPr>
-        <w:t xml:space="preserve">O presente relatório tem por objetivo demonstrar as principais atividades de   Consultoria Técnica no </w:t>
-      </w:r>
-      <w:proofErr w:type="spellStart"/>
-      <w:r>
-        <w:rPr>
-          <w:rFonts w:ascii="Arial" w:eastAsia="Arial" w:hAnsi="Arial" w:cs="Arial"/>
-          <w:sz w:val="24"/>
-          <w:szCs w:val="24"/>
-        </w:rPr>
-        <w:t>eSocial</w:t>
-      </w:r>
-      <w:proofErr w:type="spellEnd"/>
-      <w:r>
-        <w:rPr>
-          <w:rFonts w:ascii="Arial" w:eastAsia="Arial" w:hAnsi="Arial" w:cs="Arial"/>
-          <w:sz w:val="24"/>
-          <w:szCs w:val="24"/>
-        </w:rPr>
-        <w:t xml:space="preserve"> realizadas no mês de </w:t>
+        <w:t xml:space="preserve">O presente relatório tem por objetivo demonstrar as principais atividades de   Consultoria Técnica no eSocial realizadas no mês de </w:t>
       </w:r>
       <w:r>
         <w:rPr>
@@ -444,6 +404,9 @@
       </w:pPr>
       <w:r>
         <w:t xml:space="preserve"> </w:t>
+      </w:r>
+      <w:r>
+        <w:tab/>
       </w:r>
       <w:r>
         <w:rPr>
@@ -702,311 +665,26 @@
         </w:rPr>
       </w:pPr>
     </w:p>
-    <w:p>
-      <w:pPr>
-        <w:pBdr>
-          <w:top w:val="nil"/>
-          <w:left w:val="nil"/>
-          <w:bottom w:val="nil"/>
-          <w:right w:val="nil"/>
-          <w:between w:val="nil"/>
-        </w:pBdr>
-        <w:spacing w:after="0"/>
-        <w:jc w:val="both"/>
-        <w:rPr>
-          <w:rFonts w:ascii="Arial" w:eastAsia="Arial" w:hAnsi="Arial" w:cs="Arial"/>
-          <w:color w:val="000000"/>
-          <w:sz w:val="24"/>
-          <w:szCs w:val="24"/>
-        </w:rPr>
-      </w:pPr>
-    </w:p>
-    <w:p>
-      <w:pPr>
-        <w:pBdr>
-          <w:top w:val="nil"/>
-          <w:left w:val="nil"/>
-          <w:bottom w:val="nil"/>
-          <w:right w:val="nil"/>
-          <w:between w:val="nil"/>
-        </w:pBdr>
-        <w:spacing w:after="0"/>
-        <w:jc w:val="both"/>
-        <w:rPr>
-          <w:rFonts w:ascii="Arial" w:eastAsia="Arial" w:hAnsi="Arial" w:cs="Arial"/>
-          <w:color w:val="000000"/>
-          <w:sz w:val="24"/>
-          <w:szCs w:val="24"/>
-        </w:rPr>
-      </w:pPr>
-    </w:p>
-    <w:p>
-      <w:pPr>
-        <w:pBdr>
-          <w:top w:val="nil"/>
-          <w:left w:val="nil"/>
-          <w:bottom w:val="nil"/>
-          <w:right w:val="nil"/>
-          <w:between w:val="nil"/>
-        </w:pBdr>
-        <w:spacing w:after="0"/>
-        <w:jc w:val="both"/>
-        <w:rPr>
-          <w:rFonts w:ascii="Arial" w:eastAsia="Arial" w:hAnsi="Arial" w:cs="Arial"/>
-          <w:color w:val="000000"/>
-          <w:sz w:val="24"/>
-          <w:szCs w:val="24"/>
-        </w:rPr>
-      </w:pPr>
-    </w:p>
-    <w:p>
-      <w:pPr>
-        <w:pBdr>
-          <w:top w:val="nil"/>
-          <w:left w:val="nil"/>
-          <w:bottom w:val="nil"/>
-          <w:right w:val="nil"/>
-          <w:between w:val="nil"/>
-        </w:pBdr>
-        <w:spacing w:after="0"/>
-        <w:jc w:val="both"/>
-        <w:rPr>
-          <w:rFonts w:ascii="Arial" w:eastAsia="Arial" w:hAnsi="Arial" w:cs="Arial"/>
-          <w:color w:val="000000"/>
-          <w:sz w:val="24"/>
-          <w:szCs w:val="24"/>
-        </w:rPr>
-      </w:pPr>
-    </w:p>
-    <w:p>
-      <w:pPr>
-        <w:pBdr>
-          <w:top w:val="nil"/>
-          <w:left w:val="nil"/>
-          <w:bottom w:val="nil"/>
-          <w:right w:val="nil"/>
-          <w:between w:val="nil"/>
-        </w:pBdr>
-        <w:spacing w:after="0"/>
-        <w:jc w:val="both"/>
-        <w:rPr>
-          <w:rFonts w:ascii="Arial" w:eastAsia="Arial" w:hAnsi="Arial" w:cs="Arial"/>
-          <w:color w:val="000000"/>
-          <w:sz w:val="24"/>
-          <w:szCs w:val="24"/>
-        </w:rPr>
-      </w:pPr>
-    </w:p>
-    <w:p>
-      <w:pPr>
-        <w:pBdr>
-          <w:top w:val="nil"/>
-          <w:left w:val="nil"/>
-          <w:bottom w:val="nil"/>
-          <w:right w:val="nil"/>
-          <w:between w:val="nil"/>
-        </w:pBdr>
-        <w:spacing w:after="0"/>
-        <w:jc w:val="both"/>
-        <w:rPr>
-          <w:rFonts w:ascii="Arial" w:eastAsia="Arial" w:hAnsi="Arial" w:cs="Arial"/>
-          <w:color w:val="000000"/>
-          <w:sz w:val="24"/>
-          <w:szCs w:val="24"/>
-        </w:rPr>
-      </w:pPr>
-    </w:p>
-    <w:p>
-      <w:pPr>
-        <w:pBdr>
-          <w:top w:val="nil"/>
-          <w:left w:val="nil"/>
-          <w:bottom w:val="nil"/>
-          <w:right w:val="nil"/>
-          <w:between w:val="nil"/>
-        </w:pBdr>
-        <w:spacing w:after="0"/>
-        <w:jc w:val="both"/>
-        <w:rPr>
-          <w:rFonts w:ascii="Arial" w:eastAsia="Arial" w:hAnsi="Arial" w:cs="Arial"/>
-          <w:color w:val="000000"/>
-          <w:sz w:val="24"/>
-          <w:szCs w:val="24"/>
-        </w:rPr>
-      </w:pPr>
-    </w:p>
-    <w:p>
-      <w:pPr>
-        <w:pBdr>
-          <w:top w:val="nil"/>
-          <w:left w:val="nil"/>
-          <w:bottom w:val="nil"/>
-          <w:right w:val="nil"/>
-          <w:between w:val="nil"/>
-        </w:pBdr>
-        <w:spacing w:after="0"/>
-        <w:jc w:val="both"/>
-        <w:rPr>
-          <w:rFonts w:ascii="Arial" w:eastAsia="Arial" w:hAnsi="Arial" w:cs="Arial"/>
-          <w:color w:val="000000"/>
-          <w:sz w:val="24"/>
-          <w:szCs w:val="24"/>
-        </w:rPr>
-      </w:pPr>
-    </w:p>
-    <w:p>
-      <w:pPr>
-        <w:pBdr>
-          <w:top w:val="nil"/>
-          <w:left w:val="nil"/>
-          <w:bottom w:val="nil"/>
-          <w:right w:val="nil"/>
-          <w:between w:val="nil"/>
-        </w:pBdr>
-        <w:spacing w:after="0"/>
-        <w:jc w:val="both"/>
-        <w:rPr>
-          <w:rFonts w:ascii="Arial" w:eastAsia="Arial" w:hAnsi="Arial" w:cs="Arial"/>
-          <w:color w:val="000000"/>
-          <w:sz w:val="24"/>
-          <w:szCs w:val="24"/>
-        </w:rPr>
-      </w:pPr>
-    </w:p>
-    <w:p>
-      <w:pPr>
-        <w:pBdr>
-          <w:top w:val="nil"/>
-          <w:left w:val="nil"/>
-          <w:bottom w:val="nil"/>
-          <w:right w:val="nil"/>
-          <w:between w:val="nil"/>
-        </w:pBdr>
-        <w:spacing w:after="0"/>
-        <w:jc w:val="both"/>
-        <w:rPr>
-          <w:rFonts w:ascii="Arial" w:eastAsia="Arial" w:hAnsi="Arial" w:cs="Arial"/>
-          <w:color w:val="000000"/>
-          <w:sz w:val="24"/>
-          <w:szCs w:val="24"/>
-        </w:rPr>
-      </w:pPr>
-    </w:p>
-    <w:p>
-      <w:pPr>
-        <w:pBdr>
-          <w:top w:val="nil"/>
-          <w:left w:val="nil"/>
-          <w:bottom w:val="nil"/>
-          <w:right w:val="nil"/>
-          <w:between w:val="nil"/>
-        </w:pBdr>
-        <w:spacing w:after="0"/>
-        <w:jc w:val="both"/>
-        <w:rPr>
-          <w:rFonts w:ascii="Arial" w:eastAsia="Arial" w:hAnsi="Arial" w:cs="Arial"/>
-          <w:color w:val="000000"/>
-          <w:sz w:val="24"/>
-          <w:szCs w:val="24"/>
-        </w:rPr>
-      </w:pPr>
-    </w:p>
-    <w:p>
-      <w:pPr>
-        <w:pBdr>
-          <w:top w:val="nil"/>
-          <w:left w:val="nil"/>
-          <w:bottom w:val="nil"/>
-          <w:right w:val="nil"/>
-          <w:between w:val="nil"/>
-        </w:pBdr>
-        <w:spacing w:after="0"/>
-        <w:jc w:val="both"/>
-        <w:rPr>
-          <w:rFonts w:ascii="Arial" w:eastAsia="Arial" w:hAnsi="Arial" w:cs="Arial"/>
-          <w:color w:val="000000"/>
-          <w:sz w:val="24"/>
-          <w:szCs w:val="24"/>
-        </w:rPr>
-      </w:pPr>
-    </w:p>
-    <w:p>
-      <w:pPr>
-        <w:pBdr>
-          <w:top w:val="nil"/>
-          <w:left w:val="nil"/>
-          <w:bottom w:val="nil"/>
-          <w:right w:val="nil"/>
-          <w:between w:val="nil"/>
-        </w:pBdr>
-        <w:spacing w:after="0"/>
-        <w:jc w:val="both"/>
-        <w:rPr>
-          <w:rFonts w:ascii="Arial" w:eastAsia="Arial" w:hAnsi="Arial" w:cs="Arial"/>
-          <w:color w:val="000000"/>
-          <w:sz w:val="24"/>
-          <w:szCs w:val="24"/>
-        </w:rPr>
-      </w:pPr>
-    </w:p>
-    <w:p>
-      <w:pPr>
-        <w:pBdr>
-          <w:top w:val="nil"/>
-          <w:left w:val="nil"/>
-          <w:bottom w:val="nil"/>
-          <w:right w:val="nil"/>
-          <w:between w:val="nil"/>
-        </w:pBdr>
-        <w:spacing w:after="0"/>
-        <w:jc w:val="both"/>
-        <w:rPr>
-          <w:rFonts w:ascii="Arial" w:eastAsia="Arial" w:hAnsi="Arial" w:cs="Arial"/>
-          <w:color w:val="000000"/>
-          <w:sz w:val="24"/>
-          <w:szCs w:val="24"/>
-        </w:rPr>
-      </w:pPr>
-    </w:p>
-    <w:p>
-      <w:pPr>
-        <w:pBdr>
-          <w:top w:val="nil"/>
-          <w:left w:val="nil"/>
-          <w:bottom w:val="nil"/>
-          <w:right w:val="nil"/>
-          <w:between w:val="nil"/>
-        </w:pBdr>
-        <w:spacing w:after="0"/>
-        <w:jc w:val="both"/>
-        <w:rPr>
-          <w:rFonts w:ascii="Arial" w:eastAsia="Arial" w:hAnsi="Arial" w:cs="Arial"/>
-          <w:color w:val="000000"/>
-          <w:sz w:val="24"/>
-          <w:szCs w:val="24"/>
-        </w:rPr>
-      </w:pPr>
-    </w:p>
-    <w:p>
-      <w:pPr>
-        <w:pBdr>
-          <w:top w:val="nil"/>
-          <w:left w:val="nil"/>
-          <w:bottom w:val="nil"/>
-          <w:right w:val="nil"/>
-          <w:between w:val="nil"/>
-        </w:pBdr>
-        <w:spacing w:after="0"/>
-        <w:jc w:val="both"/>
-        <w:rPr>
-          <w:rFonts w:ascii="Arial" w:eastAsia="Arial" w:hAnsi="Arial" w:cs="Arial"/>
-          <w:color w:val="000000"/>
-          <w:sz w:val="24"/>
-          <w:szCs w:val="24"/>
-        </w:rPr>
-      </w:pPr>
-    </w:p>
     <w:bookmarkEnd w:id="0"/>
+    <w:p>
+      <w:pPr>
+        <w:rPr>
+          <w:rFonts w:ascii="Arial" w:eastAsia="Arial" w:hAnsi="Arial" w:cs="Arial"/>
+          <w:color w:val="2F5496"/>
+          <w:sz w:val="28"/>
+          <w:szCs w:val="28"/>
+        </w:rPr>
+      </w:pPr>
+      <w:r>
+        <w:rPr>
+          <w:rFonts w:ascii="Arial" w:eastAsia="Arial" w:hAnsi="Arial" w:cs="Arial"/>
+          <w:color w:val="2F5496"/>
+          <w:sz w:val="28"/>
+          <w:szCs w:val="28"/>
+        </w:rPr>
+        <w:br w:type="page"/>
+      </w:r>
+    </w:p>
     <w:p>
       <w:pPr>
         <w:numPr>
@@ -1036,7 +714,48 @@
           <w:sz w:val="28"/>
           <w:szCs w:val="28"/>
         </w:rPr>
+        <w:lastRenderedPageBreak/>
         <w:t>CONSIDERAÇÕES FINAIS.</w:t>
+      </w:r>
+    </w:p>
+    <w:p>
+      <w:pPr>
+        <w:spacing w:line="360" w:lineRule="auto"/>
+        <w:ind w:firstLine="360"/>
+        <w:jc w:val="both"/>
+        <w:rPr>
+          <w:rFonts w:ascii="Arial" w:eastAsia="Arial" w:hAnsi="Arial" w:cs="Arial"/>
+          <w:sz w:val="24"/>
+          <w:szCs w:val="24"/>
+        </w:rPr>
+      </w:pPr>
+      <w:r>
+        <w:rPr>
+          <w:rFonts w:ascii="Arial" w:eastAsia="Arial" w:hAnsi="Arial" w:cs="Arial"/>
+          <w:sz w:val="24"/>
+          <w:szCs w:val="24"/>
+        </w:rPr>
+        <w:t xml:space="preserve">A partir das atividades descritas no relatório, onde temos como objetivo acompanhar o desenvolvimento, fazendo do uso de ferramentas e sistemas informatizados, recurso essencial ao bom desempenho das atividades, no sentido de oferecer completo apoio gerencial com rapidez e segurança, facilitando as tomadas de decisões, que levam a uma boa administração pública desde o levantamento de dados até a estruturação dos setores administrativos, otimizando as atividades e implantando rotinas para o funcionamento satisfatório do Sistema. </w:t>
+      </w:r>
+    </w:p>
+    <w:p>
+      <w:pPr>
+        <w:spacing w:line="360" w:lineRule="auto"/>
+        <w:ind w:firstLine="360"/>
+        <w:jc w:val="both"/>
+        <w:rPr>
+          <w:rFonts w:ascii="Arial" w:eastAsia="Arial" w:hAnsi="Arial" w:cs="Arial"/>
+          <w:sz w:val="24"/>
+          <w:szCs w:val="24"/>
+        </w:rPr>
+      </w:pPr>
+      <w:r>
+        <w:rPr>
+          <w:rFonts w:ascii="Arial" w:eastAsia="Arial" w:hAnsi="Arial" w:cs="Arial"/>
+          <w:sz w:val="24"/>
+          <w:szCs w:val="24"/>
+        </w:rPr>
+        <w:t>No mais, agradecemos a atenção, ao tempo em que nos colocamos à disposição para dirimir quaisquer dúvidas.</w:t>
       </w:r>
     </w:p>
     <w:p>
@@ -1049,18 +768,9 @@
           <w:szCs w:val="24"/>
         </w:rPr>
       </w:pPr>
-      <w:r>
-        <w:rPr>
-          <w:rFonts w:ascii="Arial" w:eastAsia="Arial" w:hAnsi="Arial" w:cs="Arial"/>
-          <w:sz w:val="24"/>
-          <w:szCs w:val="24"/>
-        </w:rPr>
-        <w:t xml:space="preserve">A partir das atividades descritas no relatório, onde temos como objetivo acompanhar o desenvolvimento, fazendo do uso de ferramentas e sistemas informatizados, recurso essencial ao bom desempenho das atividades, no sentido de oferecer completo apoio gerencial com rapidez e segurança, facilitando as tomadas de decisões, que levam a uma boa administração pública desde o levantamento de dados até a estruturação dos setores administrativos, otimizando as atividades e implantando rotinas para o funcionamento satisfatório do Sistema. </w:t>
-      </w:r>
-    </w:p>
-    <w:p>
-      <w:pPr>
-        <w:spacing w:line="360" w:lineRule="auto"/>
+    </w:p>
+    <w:p>
+      <w:pPr>
         <w:jc w:val="both"/>
         <w:rPr>
           <w:rFonts w:ascii="Arial" w:eastAsia="Arial" w:hAnsi="Arial" w:cs="Arial"/>
@@ -1074,25 +784,49 @@
           <w:sz w:val="24"/>
           <w:szCs w:val="24"/>
         </w:rPr>
-        <w:t>No mais, agradecemos a atenção, ao tempo em que nos colocamos à disposição para dirimir quaisquer dúvidas.</w:t>
-      </w:r>
-    </w:p>
-    <w:p>
-      <w:pPr>
-        <w:spacing w:line="360" w:lineRule="auto"/>
-        <w:jc w:val="both"/>
-        <w:rPr>
-          <w:rFonts w:ascii="Arial" w:eastAsia="Arial" w:hAnsi="Arial" w:cs="Arial"/>
-          <w:sz w:val="24"/>
-          <w:szCs w:val="24"/>
-        </w:rPr>
-      </w:pPr>
-    </w:p>
-    <w:p>
-      <w:pPr>
-        <w:jc w:val="both"/>
-        <w:rPr>
-          <w:rFonts w:ascii="Arial" w:eastAsia="Arial" w:hAnsi="Arial" w:cs="Arial"/>
+        <w:t xml:space="preserve">Salvador - BA, </w:t>
+      </w:r>
+      <w:r>
+        <w:rPr>
+          <w:rFonts w:ascii="Arial" w:eastAsia="Arial" w:hAnsi="Arial" w:cs="Arial"/>
+          <w:sz w:val="24"/>
+          <w:szCs w:val="24"/>
+        </w:rPr>
+        <w:t>{</w:t>
+      </w:r>
+      <w:proofErr w:type="spellStart"/>
+      <w:r>
+        <w:rPr>
+          <w:rFonts w:ascii="Arial" w:eastAsia="Arial" w:hAnsi="Arial" w:cs="Arial"/>
+          <w:sz w:val="24"/>
+          <w:szCs w:val="24"/>
+        </w:rPr>
+        <w:t>data_extenso_emissao</w:t>
+      </w:r>
+      <w:proofErr w:type="spellEnd"/>
+      <w:r>
+        <w:rPr>
+          <w:rFonts w:ascii="Arial" w:eastAsia="Arial" w:hAnsi="Arial" w:cs="Arial"/>
+          <w:sz w:val="24"/>
+          <w:szCs w:val="24"/>
+        </w:rPr>
+        <w:t>}</w:t>
+      </w:r>
+      <w:r>
+        <w:rPr>
+          <w:rFonts w:ascii="Arial" w:eastAsia="Arial" w:hAnsi="Arial" w:cs="Arial"/>
+          <w:sz w:val="24"/>
+          <w:szCs w:val="24"/>
+        </w:rPr>
+        <w:t>.</w:t>
+      </w:r>
+    </w:p>
+    <w:p>
+      <w:pPr>
+        <w:jc w:val="center"/>
+        <w:rPr>
+          <w:rFonts w:ascii="Arial" w:eastAsia="Arial" w:hAnsi="Arial" w:cs="Arial"/>
+          <w:b/>
           <w:sz w:val="24"/>
           <w:szCs w:val="24"/>
         </w:rPr>
@@ -1102,13 +836,13 @@
           <w:noProof/>
         </w:rPr>
         <w:drawing>
-          <wp:anchor distT="0" distB="0" distL="114300" distR="114300" simplePos="0" relativeHeight="251662336" behindDoc="0" locked="0" layoutInCell="1" hidden="0" allowOverlap="1" wp14:anchorId="539A5269" wp14:editId="7C6F2511">
+          <wp:anchor distT="0" distB="0" distL="114300" distR="114300" simplePos="0" relativeHeight="251662336" behindDoc="0" locked="0" layoutInCell="1" hidden="0" allowOverlap="1" wp14:anchorId="539A5269" wp14:editId="7F8F3461">
             <wp:simplePos x="0" y="0"/>
-            <wp:positionH relativeFrom="column">
-              <wp:posOffset>1939290</wp:posOffset>
+            <wp:positionH relativeFrom="margin">
+              <wp:posOffset>2073910</wp:posOffset>
             </wp:positionH>
             <wp:positionV relativeFrom="paragraph">
-              <wp:posOffset>76835</wp:posOffset>
+              <wp:posOffset>6985</wp:posOffset>
             </wp:positionV>
             <wp:extent cx="885825" cy="1333500"/>
             <wp:effectExtent l="0" t="0" r="0" b="0"/>
@@ -1145,59 +879,6 @@
           </wp:anchor>
         </w:drawing>
       </w:r>
-      <w:r>
-        <w:rPr>
-          <w:rFonts w:ascii="Arial" w:eastAsia="Arial" w:hAnsi="Arial" w:cs="Arial"/>
-          <w:sz w:val="24"/>
-          <w:szCs w:val="24"/>
-        </w:rPr>
-        <w:t xml:space="preserve">Salvador - BA, </w:t>
-      </w:r>
-      <w:r>
-        <w:rPr>
-          <w:rFonts w:ascii="Arial" w:eastAsia="Arial" w:hAnsi="Arial" w:cs="Arial"/>
-          <w:sz w:val="24"/>
-          <w:szCs w:val="24"/>
-        </w:rPr>
-        <w:t>{</w:t>
-      </w:r>
-      <w:proofErr w:type="spellStart"/>
-      <w:r>
-        <w:rPr>
-          <w:rFonts w:ascii="Arial" w:eastAsia="Arial" w:hAnsi="Arial" w:cs="Arial"/>
-          <w:sz w:val="24"/>
-          <w:szCs w:val="24"/>
-        </w:rPr>
-        <w:t>data_extenso_emissao</w:t>
-      </w:r>
-      <w:proofErr w:type="spellEnd"/>
-      <w:r>
-        <w:rPr>
-          <w:rFonts w:ascii="Arial" w:eastAsia="Arial" w:hAnsi="Arial" w:cs="Arial"/>
-          <w:sz w:val="24"/>
-          <w:szCs w:val="24"/>
-        </w:rPr>
-        <w:t>}</w:t>
-      </w:r>
-      <w:r>
-        <w:rPr>
-          <w:rFonts w:ascii="Arial" w:eastAsia="Arial" w:hAnsi="Arial" w:cs="Arial"/>
-          <w:sz w:val="24"/>
-          <w:szCs w:val="24"/>
-        </w:rPr>
-        <w:t>.</w:t>
-      </w:r>
-    </w:p>
-    <w:p>
-      <w:pPr>
-        <w:jc w:val="center"/>
-        <w:rPr>
-          <w:rFonts w:ascii="Arial" w:eastAsia="Arial" w:hAnsi="Arial" w:cs="Arial"/>
-          <w:b/>
-          <w:sz w:val="24"/>
-          <w:szCs w:val="24"/>
-        </w:rPr>
-      </w:pPr>
     </w:p>
     <w:p>
       <w:pPr>
@@ -1256,7 +937,7 @@
       <w:footerReference w:type="default" r:id="rId11"/>
       <w:headerReference w:type="first" r:id="rId12"/>
       <w:pgSz w:w="11906" w:h="16838"/>
-      <w:pgMar w:top="1417" w:right="1701" w:bottom="1417" w:left="1701" w:header="708" w:footer="708" w:gutter="0"/>
+      <w:pgMar w:top="2552" w:right="1701" w:bottom="1418" w:left="1701" w:header="709" w:footer="709" w:gutter="0"/>
       <w:cols w:space="708"/>
       <w:docGrid w:linePitch="360"/>
     </w:sectPr>
@@ -1265,7 +946,7 @@
 </file>
 
 <file path=word/endnotes.xml><?xml version="1.0" encoding="utf-8"?>
-<w:endnotes xmlns:wpc="http://schemas.microsoft.com/office/word/2010/wordprocessingCanvas" xmlns:cx="http://schemas.microsoft.com/office/drawing/2014/chartex" xmlns:cx1="http://schemas.microsoft.com/office/drawing/2015/9/8/chartex" xmlns:cx2="http://schemas.microsoft.com/office/drawing/2015/10/21/chartex" xmlns:cx3="http://schemas.microsoft.com/office/drawing/2016/5/9/chartex" xmlns:cx4="http://schemas.microsoft.com/office/drawing/2016/5/10/chartex" xmlns:cx5="http://schemas.microsoft.com/office/drawing/2016/5/11/chartex" xmlns:cx6="http://schemas.microsoft.com/office/drawing/2016/5/12/chartex" xmlns:cx7="http://schemas.microsoft.com/office/drawing/2016/5/13/chartex" xmlns:cx8="http://schemas.microsoft.com/office/drawing/2016/5/14/chartex" xmlns:mc="http://schemas.openxmlformats.org/markup-compatibility/2006" xmlns:aink="http://schemas.microsoft.com/office/drawing/2016/ink" xmlns:am3d="http://schemas.microsoft.com/office/drawing/2017/model3d" xmlns:o="urn:schemas-microsoft-com:office:office" xmlns:oel="http://schemas.microsoft.com/office/2019/extlst" xmlns:r="http://schemas.openxmlformats.org/officeDocument/2006/relationships" xmlns:m="http://schemas.openxmlformats.org/officeDocument/2006/math" xmlns:v="urn:schemas-microsoft-com:vml" xmlns:wp14="http://schemas.microsoft.com/office/word/2010/wordprocessingDrawing" xmlns:wp="http://schemas.openxmlformats.org/drawingml/2006/wordprocessingDrawing" xmlns:w10="urn:schemas-microsoft-com:office:word" xmlns:w="http://schemas.openxmlformats.org/wordprocessingml/2006/main" xmlns:w14="http://schemas.microsoft.com/office/word/2010/wordml" xmlns:w15="http://schemas.microsoft.com/office/word/2012/wordml" xmlns:w16cex="http://schemas.microsoft.com/office/word/2018/wordml/cex" xmlns:w16cid="http://schemas.microsoft.com/office/word/2016/wordml/cid" xmlns:w16="http://schemas.microsoft.com/office/word/2018/wordml" xmlns:w16sdtdh="http://schemas.microsoft.com/office/word/2020/wordml/sdtdatahash" xmlns:w16se="http://schemas.microsoft.com/office/word/2015/wordml/symex" xmlns:wpg="http://schemas.microsoft.com/office/word/2010/wordprocessingGroup" xmlns:wpi="http://schemas.microsoft.com/office/word/2010/wordprocessingInk" xmlns:wne="http://schemas.microsoft.com/office/word/2006/wordml" xmlns:wps="http://schemas.microsoft.com/office/word/2010/wordprocessingShape" mc:Ignorable="w14 w15 w16se w16cid w16 w16cex w16sdtdh wp14">
+<w:endnotes xmlns:wpc="http://schemas.microsoft.com/office/word/2010/wordprocessingCanvas" xmlns:cx="http://schemas.microsoft.com/office/drawing/2014/chartex" xmlns:cx1="http://schemas.microsoft.com/office/drawing/2015/9/8/chartex" xmlns:cx2="http://schemas.microsoft.com/office/drawing/2015/10/21/chartex" xmlns:cx3="http://schemas.microsoft.com/office/drawing/2016/5/9/chartex" xmlns:cx4="http://schemas.microsoft.com/office/drawing/2016/5/10/chartex" xmlns:cx5="http://schemas.microsoft.com/office/drawing/2016/5/11/chartex" xmlns:cx6="http://schemas.microsoft.com/office/drawing/2016/5/12/chartex" xmlns:cx7="http://schemas.microsoft.com/office/drawing/2016/5/13/chartex" xmlns:cx8="http://schemas.microsoft.com/office/drawing/2016/5/14/chartex" xmlns:mc="http://schemas.openxmlformats.org/markup-compatibility/2006" xmlns:aink="http://schemas.microsoft.com/office/drawing/2016/ink" xmlns:am3d="http://schemas.microsoft.com/office/drawing/2017/model3d" xmlns:o="urn:schemas-microsoft-com:office:office" xmlns:oel="http://schemas.microsoft.com/office/2019/extlst" xmlns:r="http://schemas.openxmlformats.org/officeDocument/2006/relationships" xmlns:m="http://schemas.openxmlformats.org/officeDocument/2006/math" xmlns:v="urn:schemas-microsoft-com:vml" xmlns:wp14="http://schemas.microsoft.com/office/word/2010/wordprocessingDrawing" xmlns:wp="http://schemas.openxmlformats.org/drawingml/2006/wordprocessingDrawing" xmlns:w10="urn:schemas-microsoft-com:office:word" xmlns:w="http://schemas.openxmlformats.org/wordprocessingml/2006/main" xmlns:w14="http://schemas.microsoft.com/office/word/2010/wordml" xmlns:w15="http://schemas.microsoft.com/office/word/2012/wordml" xmlns:w16cex="http://schemas.microsoft.com/office/word/2018/wordml/cex" xmlns:w16cid="http://schemas.microsoft.com/office/word/2016/wordml/cid" xmlns:w16="http://schemas.microsoft.com/office/word/2018/wordml" xmlns:w16du="http://schemas.microsoft.com/office/word/2023/wordml/word16du" xmlns:w16sdtdh="http://schemas.microsoft.com/office/word/2020/wordml/sdtdatahash" xmlns:w16sdtfl="http://schemas.microsoft.com/office/word/2024/wordml/sdtformatlock" xmlns:w16se="http://schemas.microsoft.com/office/word/2015/wordml/symex" xmlns:wpg="http://schemas.microsoft.com/office/word/2010/wordprocessingGroup" xmlns:wpi="http://schemas.microsoft.com/office/word/2010/wordprocessingInk" xmlns:wne="http://schemas.microsoft.com/office/word/2006/wordml" xmlns:wps="http://schemas.microsoft.com/office/word/2010/wordprocessingShape" mc:Ignorable="w14 w15 w16se w16cid w16 w16cex w16sdtdh w16sdtfl w16du wp14">
   <w:endnote w:type="separator" w:id="-1">
     <w:p>
       <w:pPr>
@@ -1290,7 +971,7 @@
 </file>
 
 <file path=word/footer1.xml><?xml version="1.0" encoding="utf-8"?>
-<w:ftr xmlns:wpc="http://schemas.microsoft.com/office/word/2010/wordprocessingCanvas" xmlns:cx="http://schemas.microsoft.com/office/drawing/2014/chartex" xmlns:cx1="http://schemas.microsoft.com/office/drawing/2015/9/8/chartex" xmlns:cx2="http://schemas.microsoft.com/office/drawing/2015/10/21/chartex" xmlns:cx3="http://schemas.microsoft.com/office/drawing/2016/5/9/chartex" xmlns:cx4="http://schemas.microsoft.com/office/drawing/2016/5/10/chartex" xmlns:cx5="http://schemas.microsoft.com/office/drawing/2016/5/11/chartex" xmlns:cx6="http://schemas.microsoft.com/office/drawing/2016/5/12/chartex" xmlns:cx7="http://schemas.microsoft.com/office/drawing/2016/5/13/chartex" xmlns:cx8="http://schemas.microsoft.com/office/drawing/2016/5/14/chartex" xmlns:mc="http://schemas.openxmlformats.org/markup-compatibility/2006" xmlns:aink="http://schemas.microsoft.com/office/drawing/2016/ink" xmlns:am3d="http://schemas.microsoft.com/office/drawing/2017/model3d" xmlns:o="urn:schemas-microsoft-com:office:office" xmlns:oel="http://schemas.microsoft.com/office/2019/extlst" xmlns:r="http://schemas.openxmlformats.org/officeDocument/2006/relationships" xmlns:m="http://schemas.openxmlformats.org/officeDocument/2006/math" xmlns:v="urn:schemas-microsoft-com:vml" xmlns:wp14="http://schemas.microsoft.com/office/word/2010/wordprocessingDrawing" xmlns:wp="http://schemas.openxmlformats.org/drawingml/2006/wordprocessingDrawing" xmlns:w10="urn:schemas-microsoft-com:office:word" xmlns:w="http://schemas.openxmlformats.org/wordprocessingml/2006/main" xmlns:w14="http://schemas.microsoft.com/office/word/2010/wordml" xmlns:w15="http://schemas.microsoft.com/office/word/2012/wordml" xmlns:w16cex="http://schemas.microsoft.com/office/word/2018/wordml/cex" xmlns:w16cid="http://schemas.microsoft.com/office/word/2016/wordml/cid" xmlns:w16="http://schemas.microsoft.com/office/word/2018/wordml" xmlns:w16sdtdh="http://schemas.microsoft.com/office/word/2020/wordml/sdtdatahash" xmlns:w16se="http://schemas.microsoft.com/office/word/2015/wordml/symex" xmlns:wpg="http://schemas.microsoft.com/office/word/2010/wordprocessingGroup" xmlns:wpi="http://schemas.microsoft.com/office/word/2010/wordprocessingInk" xmlns:wne="http://schemas.microsoft.com/office/word/2006/wordml" xmlns:wps="http://schemas.microsoft.com/office/word/2010/wordprocessingShape" mc:Ignorable="w14 w15 w16se w16cid w16 w16cex w16sdtdh wp14">
+<w:ftr xmlns:wpc="http://schemas.microsoft.com/office/word/2010/wordprocessingCanvas" xmlns:cx="http://schemas.microsoft.com/office/drawing/2014/chartex" xmlns:cx1="http://schemas.microsoft.com/office/drawing/2015/9/8/chartex" xmlns:cx2="http://schemas.microsoft.com/office/drawing/2015/10/21/chartex" xmlns:cx3="http://schemas.microsoft.com/office/drawing/2016/5/9/chartex" xmlns:cx4="http://schemas.microsoft.com/office/drawing/2016/5/10/chartex" xmlns:cx5="http://schemas.microsoft.com/office/drawing/2016/5/11/chartex" xmlns:cx6="http://schemas.microsoft.com/office/drawing/2016/5/12/chartex" xmlns:cx7="http://schemas.microsoft.com/office/drawing/2016/5/13/chartex" xmlns:cx8="http://schemas.microsoft.com/office/drawing/2016/5/14/chartex" xmlns:mc="http://schemas.openxmlformats.org/markup-compatibility/2006" xmlns:aink="http://schemas.microsoft.com/office/drawing/2016/ink" xmlns:am3d="http://schemas.microsoft.com/office/drawing/2017/model3d" xmlns:o="urn:schemas-microsoft-com:office:office" xmlns:oel="http://schemas.microsoft.com/office/2019/extlst" xmlns:r="http://schemas.openxmlformats.org/officeDocument/2006/relationships" xmlns:m="http://schemas.openxmlformats.org/officeDocument/2006/math" xmlns:v="urn:schemas-microsoft-com:vml" xmlns:wp14="http://schemas.microsoft.com/office/word/2010/wordprocessingDrawing" xmlns:wp="http://schemas.openxmlformats.org/drawingml/2006/wordprocessingDrawing" xmlns:w10="urn:schemas-microsoft-com:office:word" xmlns:w="http://schemas.openxmlformats.org/wordprocessingml/2006/main" xmlns:w14="http://schemas.microsoft.com/office/word/2010/wordml" xmlns:w15="http://schemas.microsoft.com/office/word/2012/wordml" xmlns:w16cex="http://schemas.microsoft.com/office/word/2018/wordml/cex" xmlns:w16cid="http://schemas.microsoft.com/office/word/2016/wordml/cid" xmlns:w16="http://schemas.microsoft.com/office/word/2018/wordml" xmlns:w16du="http://schemas.microsoft.com/office/word/2023/wordml/word16du" xmlns:w16sdtdh="http://schemas.microsoft.com/office/word/2020/wordml/sdtdatahash" xmlns:w16sdtfl="http://schemas.microsoft.com/office/word/2024/wordml/sdtformatlock" xmlns:w16se="http://schemas.microsoft.com/office/word/2015/wordml/symex" xmlns:wpg="http://schemas.microsoft.com/office/word/2010/wordprocessingGroup" xmlns:wpi="http://schemas.microsoft.com/office/word/2010/wordprocessingInk" xmlns:wne="http://schemas.microsoft.com/office/word/2006/wordml" xmlns:wps="http://schemas.microsoft.com/office/word/2010/wordprocessingShape" mc:Ignorable="w14 w15 w16se w16cid w16 w16cex w16sdtdh w16sdtfl w16du wp14">
   <w:p>
     <w:pPr>
       <w:pStyle w:val="Default"/>
@@ -1466,7 +1147,7 @@
             </wp:anchor>
           </w:drawing>
         </mc:Choice>
-        <mc:Fallback xmlns:w16du="http://schemas.microsoft.com/office/word/2023/wordml/word16du">
+        <mc:Fallback>
           <w:pict>
             <v:rect w14:anchorId="19ED059C" id="Retângulo 2" o:spid="_x0000_s1026" style="position:absolute;margin-left:0;margin-top:16.25pt;width:610.55pt;height:39.35pt;z-index:251661312;visibility:visible;mso-wrap-style:square;mso-wrap-distance-left:9pt;mso-wrap-distance-top:0;mso-wrap-distance-right:9pt;mso-wrap-distance-bottom:0;mso-position-horizontal:left;mso-position-horizontal-relative:page;mso-position-vertical:absolute;mso-position-vertical-relative:text;v-text-anchor:middle" o:gfxdata="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" fillcolor="#0d3d80" strokecolor="#0d3d80" strokeweight="1pt">
               <w10:wrap anchorx="page"/>
@@ -1492,7 +1173,7 @@
 </file>
 
 <file path=word/footnotes.xml><?xml version="1.0" encoding="utf-8"?>
-<w:footnotes xmlns:wpc="http://schemas.microsoft.com/office/word/2010/wordprocessingCanvas" xmlns:cx="http://schemas.microsoft.com/office/drawing/2014/chartex" xmlns:cx1="http://schemas.microsoft.com/office/drawing/2015/9/8/chartex" xmlns:cx2="http://schemas.microsoft.com/office/drawing/2015/10/21/chartex" xmlns:cx3="http://schemas.microsoft.com/office/drawing/2016/5/9/chartex" xmlns:cx4="http://schemas.microsoft.com/office/drawing/2016/5/10/chartex" xmlns:cx5="http://schemas.microsoft.com/office/drawing/2016/5/11/chartex" xmlns:cx6="http://schemas.microsoft.com/office/drawing/2016/5/12/chartex" xmlns:cx7="http://schemas.microsoft.com/office/drawing/2016/5/13/chartex" xmlns:cx8="http://schemas.microsoft.com/office/drawing/2016/5/14/chartex" xmlns:mc="http://schemas.openxmlformats.org/markup-compatibility/2006" xmlns:aink="http://schemas.microsoft.com/office/drawing/2016/ink" xmlns:am3d="http://schemas.microsoft.com/office/drawing/2017/model3d" xmlns:o="urn:schemas-microsoft-com:office:office" xmlns:oel="http://schemas.microsoft.com/office/2019/extlst" xmlns:r="http://schemas.openxmlformats.org/officeDocument/2006/relationships" xmlns:m="http://schemas.openxmlformats.org/officeDocument/2006/math" xmlns:v="urn:schemas-microsoft-com:vml" xmlns:wp14="http://schemas.microsoft.com/office/word/2010/wordprocessingDrawing" xmlns:wp="http://schemas.openxmlformats.org/drawingml/2006/wordprocessingDrawing" xmlns:w10="urn:schemas-microsoft-com:office:word" xmlns:w="http://schemas.openxmlformats.org/wordprocessingml/2006/main" xmlns:w14="http://schemas.microsoft.com/office/word/2010/wordml" xmlns:w15="http://schemas.microsoft.com/office/word/2012/wordml" xmlns:w16cex="http://schemas.microsoft.com/office/word/2018/wordml/cex" xmlns:w16cid="http://schemas.microsoft.com/office/word/2016/wordml/cid" xmlns:w16="http://schemas.microsoft.com/office/word/2018/wordml" xmlns:w16sdtdh="http://schemas.microsoft.com/office/word/2020/wordml/sdtdatahash" xmlns:w16se="http://schemas.microsoft.com/office/word/2015/wordml/symex" xmlns:wpg="http://schemas.microsoft.com/office/word/2010/wordprocessingGroup" xmlns:wpi="http://schemas.microsoft.com/office/word/2010/wordprocessingInk" xmlns:wne="http://schemas.microsoft.com/office/word/2006/wordml" xmlns:wps="http://schemas.microsoft.com/office/word/2010/wordprocessingShape" mc:Ignorable="w14 w15 w16se w16cid w16 w16cex w16sdtdh wp14">
+<w:footnotes xmlns:wpc="http://schemas.microsoft.com/office/word/2010/wordprocessingCanvas" xmlns:cx="http://schemas.microsoft.com/office/drawing/2014/chartex" xmlns:cx1="http://schemas.microsoft.com/office/drawing/2015/9/8/chartex" xmlns:cx2="http://schemas.microsoft.com/office/drawing/2015/10/21/chartex" xmlns:cx3="http://schemas.microsoft.com/office/drawing/2016/5/9/chartex" xmlns:cx4="http://schemas.microsoft.com/office/drawing/2016/5/10/chartex" xmlns:cx5="http://schemas.microsoft.com/office/drawing/2016/5/11/chartex" xmlns:cx6="http://schemas.microsoft.com/office/drawing/2016/5/12/chartex" xmlns:cx7="http://schemas.microsoft.com/office/drawing/2016/5/13/chartex" xmlns:cx8="http://schemas.microsoft.com/office/drawing/2016/5/14/chartex" xmlns:mc="http://schemas.openxmlformats.org/markup-compatibility/2006" xmlns:aink="http://schemas.microsoft.com/office/drawing/2016/ink" xmlns:am3d="http://schemas.microsoft.com/office/drawing/2017/model3d" xmlns:o="urn:schemas-microsoft-com:office:office" xmlns:oel="http://schemas.microsoft.com/office/2019/extlst" xmlns:r="http://schemas.openxmlformats.org/officeDocument/2006/relationships" xmlns:m="http://schemas.openxmlformats.org/officeDocument/2006/math" xmlns:v="urn:schemas-microsoft-com:vml" xmlns:wp14="http://schemas.microsoft.com/office/word/2010/wordprocessingDrawing" xmlns:wp="http://schemas.openxmlformats.org/drawingml/2006/wordprocessingDrawing" xmlns:w10="urn:schemas-microsoft-com:office:word" xmlns:w="http://schemas.openxmlformats.org/wordprocessingml/2006/main" xmlns:w14="http://schemas.microsoft.com/office/word/2010/wordml" xmlns:w15="http://schemas.microsoft.com/office/word/2012/wordml" xmlns:w16cex="http://schemas.microsoft.com/office/word/2018/wordml/cex" xmlns:w16cid="http://schemas.microsoft.com/office/word/2016/wordml/cid" xmlns:w16="http://schemas.microsoft.com/office/word/2018/wordml" xmlns:w16du="http://schemas.microsoft.com/office/word/2023/wordml/word16du" xmlns:w16sdtdh="http://schemas.microsoft.com/office/word/2020/wordml/sdtdatahash" xmlns:w16sdtfl="http://schemas.microsoft.com/office/word/2024/wordml/sdtformatlock" xmlns:w16se="http://schemas.microsoft.com/office/word/2015/wordml/symex" xmlns:wpg="http://schemas.microsoft.com/office/word/2010/wordprocessingGroup" xmlns:wpi="http://schemas.microsoft.com/office/word/2010/wordprocessingInk" xmlns:wne="http://schemas.microsoft.com/office/word/2006/wordml" xmlns:wps="http://schemas.microsoft.com/office/word/2010/wordprocessingShape" mc:Ignorable="w14 w15 w16se w16cid w16 w16cex w16sdtdh w16sdtfl w16du wp14">
   <w:footnote w:type="separator" w:id="-1">
     <w:p>
       <w:pPr>
@@ -1517,7 +1198,7 @@
 </file>
 
 <file path=word/header1.xml><?xml version="1.0" encoding="utf-8"?>
-<w:hdr xmlns:wpc="http://schemas.microsoft.com/office/word/2010/wordprocessingCanvas" xmlns:cx="http://schemas.microsoft.com/office/drawing/2014/chartex" xmlns:cx1="http://schemas.microsoft.com/office/drawing/2015/9/8/chartex" xmlns:cx2="http://schemas.microsoft.com/office/drawing/2015/10/21/chartex" xmlns:cx3="http://schemas.microsoft.com/office/drawing/2016/5/9/chartex" xmlns:cx4="http://schemas.microsoft.com/office/drawing/2016/5/10/chartex" xmlns:cx5="http://schemas.microsoft.com/office/drawing/2016/5/11/chartex" xmlns:cx6="http://schemas.microsoft.com/office/drawing/2016/5/12/chartex" xmlns:cx7="http://schemas.microsoft.com/office/drawing/2016/5/13/chartex" xmlns:cx8="http://schemas.microsoft.com/office/drawing/2016/5/14/chartex" xmlns:mc="http://schemas.openxmlformats.org/markup-compatibility/2006" xmlns:aink="http://schemas.microsoft.com/office/drawing/2016/ink" xmlns:am3d="http://schemas.microsoft.com/office/drawing/2017/model3d" xmlns:o="urn:schemas-microsoft-com:office:office" xmlns:oel="http://schemas.microsoft.com/office/2019/extlst" xmlns:r="http://schemas.openxmlformats.org/officeDocument/2006/relationships" xmlns:m="http://schemas.openxmlformats.org/officeDocument/2006/math" xmlns:v="urn:schemas-microsoft-com:vml" xmlns:wp14="http://schemas.microsoft.com/office/word/2010/wordprocessingDrawing" xmlns:wp="http://schemas.openxmlformats.org/drawingml/2006/wordprocessingDrawing" xmlns:w10="urn:schemas-microsoft-com:office:word" xmlns:w="http://schemas.openxmlformats.org/wordprocessingml/2006/main" xmlns:w14="http://schemas.microsoft.com/office/word/2010/wordml" xmlns:w15="http://schemas.microsoft.com/office/word/2012/wordml" xmlns:w16cex="http://schemas.microsoft.com/office/word/2018/wordml/cex" xmlns:w16cid="http://schemas.microsoft.com/office/word/2016/wordml/cid" xmlns:w16="http://schemas.microsoft.com/office/word/2018/wordml" xmlns:w16sdtdh="http://schemas.microsoft.com/office/word/2020/wordml/sdtdatahash" xmlns:w16se="http://schemas.microsoft.com/office/word/2015/wordml/symex" xmlns:wpg="http://schemas.microsoft.com/office/word/2010/wordprocessingGroup" xmlns:wpi="http://schemas.microsoft.com/office/word/2010/wordprocessingInk" xmlns:wne="http://schemas.microsoft.com/office/word/2006/wordml" xmlns:wps="http://schemas.microsoft.com/office/word/2010/wordprocessingShape" mc:Ignorable="w14 w15 w16se w16cid w16 w16cex w16sdtdh wp14">
+<w:hdr xmlns:wpc="http://schemas.microsoft.com/office/word/2010/wordprocessingCanvas" xmlns:cx="http://schemas.microsoft.com/office/drawing/2014/chartex" xmlns:cx1="http://schemas.microsoft.com/office/drawing/2015/9/8/chartex" xmlns:cx2="http://schemas.microsoft.com/office/drawing/2015/10/21/chartex" xmlns:cx3="http://schemas.microsoft.com/office/drawing/2016/5/9/chartex" xmlns:cx4="http://schemas.microsoft.com/office/drawing/2016/5/10/chartex" xmlns:cx5="http://schemas.microsoft.com/office/drawing/2016/5/11/chartex" xmlns:cx6="http://schemas.microsoft.com/office/drawing/2016/5/12/chartex" xmlns:cx7="http://schemas.microsoft.com/office/drawing/2016/5/13/chartex" xmlns:cx8="http://schemas.microsoft.com/office/drawing/2016/5/14/chartex" xmlns:mc="http://schemas.openxmlformats.org/markup-compatibility/2006" xmlns:aink="http://schemas.microsoft.com/office/drawing/2016/ink" xmlns:am3d="http://schemas.microsoft.com/office/drawing/2017/model3d" xmlns:o="urn:schemas-microsoft-com:office:office" xmlns:oel="http://schemas.microsoft.com/office/2019/extlst" xmlns:r="http://schemas.openxmlformats.org/officeDocument/2006/relationships" xmlns:m="http://schemas.openxmlformats.org/officeDocument/2006/math" xmlns:v="urn:schemas-microsoft-com:vml" xmlns:wp14="http://schemas.microsoft.com/office/word/2010/wordprocessingDrawing" xmlns:wp="http://schemas.openxmlformats.org/drawingml/2006/wordprocessingDrawing" xmlns:w10="urn:schemas-microsoft-com:office:word" xmlns:w="http://schemas.openxmlformats.org/wordprocessingml/2006/main" xmlns:w14="http://schemas.microsoft.com/office/word/2010/wordml" xmlns:w15="http://schemas.microsoft.com/office/word/2012/wordml" xmlns:w16cex="http://schemas.microsoft.com/office/word/2018/wordml/cex" xmlns:w16cid="http://schemas.microsoft.com/office/word/2016/wordml/cid" xmlns:w16="http://schemas.microsoft.com/office/word/2018/wordml" xmlns:w16du="http://schemas.microsoft.com/office/word/2023/wordml/word16du" xmlns:w16sdtdh="http://schemas.microsoft.com/office/word/2020/wordml/sdtdatahash" xmlns:w16sdtfl="http://schemas.microsoft.com/office/word/2024/wordml/sdtformatlock" xmlns:w16se="http://schemas.microsoft.com/office/word/2015/wordml/symex" xmlns:wpg="http://schemas.microsoft.com/office/word/2010/wordprocessingGroup" xmlns:wpi="http://schemas.microsoft.com/office/word/2010/wordprocessingInk" xmlns:wne="http://schemas.microsoft.com/office/word/2006/wordml" xmlns:wps="http://schemas.microsoft.com/office/word/2010/wordprocessingShape" mc:Ignorable="w14 w15 w16se w16cid w16 w16cex w16sdtdh w16sdtfl w16du wp14">
   <w:p>
     <w:pPr>
       <w:pStyle w:val="Cabealho"/>
@@ -1557,7 +1238,7 @@
 </file>
 
 <file path=word/header2.xml><?xml version="1.0" encoding="utf-8"?>
-<w:hdr xmlns:wpc="http://schemas.microsoft.com/office/word/2010/wordprocessingCanvas" xmlns:cx="http://schemas.microsoft.com/office/drawing/2014/chartex" xmlns:cx1="http://schemas.microsoft.com/office/drawing/2015/9/8/chartex" xmlns:cx2="http://schemas.microsoft.com/office/drawing/2015/10/21/chartex" xmlns:cx3="http://schemas.microsoft.com/office/drawing/2016/5/9/chartex" xmlns:cx4="http://schemas.microsoft.com/office/drawing/2016/5/10/chartex" xmlns:cx5="http://schemas.microsoft.com/office/drawing/2016/5/11/chartex" xmlns:cx6="http://schemas.microsoft.com/office/drawing/2016/5/12/chartex" xmlns:cx7="http://schemas.microsoft.com/office/drawing/2016/5/13/chartex" xmlns:cx8="http://schemas.microsoft.com/office/drawing/2016/5/14/chartex" xmlns:mc="http://schemas.openxmlformats.org/markup-compatibility/2006" xmlns:aink="http://schemas.microsoft.com/office/drawing/2016/ink" xmlns:am3d="http://schemas.microsoft.com/office/drawing/2017/model3d" xmlns:o="urn:schemas-microsoft-com:office:office" xmlns:oel="http://schemas.microsoft.com/office/2019/extlst" xmlns:r="http://schemas.openxmlformats.org/officeDocument/2006/relationships" xmlns:m="http://schemas.openxmlformats.org/officeDocument/2006/math" xmlns:v="urn:schemas-microsoft-com:vml" xmlns:wp14="http://schemas.microsoft.com/office/word/2010/wordprocessingDrawing" xmlns:wp="http://schemas.openxmlformats.org/drawingml/2006/wordprocessingDrawing" xmlns:w10="urn:schemas-microsoft-com:office:word" xmlns:w="http://schemas.openxmlformats.org/wordprocessingml/2006/main" xmlns:w14="http://schemas.microsoft.com/office/word/2010/wordml" xmlns:w15="http://schemas.microsoft.com/office/word/2012/wordml" xmlns:w16cex="http://schemas.microsoft.com/office/word/2018/wordml/cex" xmlns:w16cid="http://schemas.microsoft.com/office/word/2016/wordml/cid" xmlns:w16="http://schemas.microsoft.com/office/word/2018/wordml" xmlns:w16sdtdh="http://schemas.microsoft.com/office/word/2020/wordml/sdtdatahash" xmlns:w16se="http://schemas.microsoft.com/office/word/2015/wordml/symex" xmlns:wpg="http://schemas.microsoft.com/office/word/2010/wordprocessingGroup" xmlns:wpi="http://schemas.microsoft.com/office/word/2010/wordprocessingInk" xmlns:wne="http://schemas.microsoft.com/office/word/2006/wordml" xmlns:wps="http://schemas.microsoft.com/office/word/2010/wordprocessingShape" mc:Ignorable="w14 w15 w16se w16cid w16 w16cex w16sdtdh wp14">
+<w:hdr xmlns:wpc="http://schemas.microsoft.com/office/word/2010/wordprocessingCanvas" xmlns:cx="http://schemas.microsoft.com/office/drawing/2014/chartex" xmlns:cx1="http://schemas.microsoft.com/office/drawing/2015/9/8/chartex" xmlns:cx2="http://schemas.microsoft.com/office/drawing/2015/10/21/chartex" xmlns:cx3="http://schemas.microsoft.com/office/drawing/2016/5/9/chartex" xmlns:cx4="http://schemas.microsoft.com/office/drawing/2016/5/10/chartex" xmlns:cx5="http://schemas.microsoft.com/office/drawing/2016/5/11/chartex" xmlns:cx6="http://schemas.microsoft.com/office/drawing/2016/5/12/chartex" xmlns:cx7="http://schemas.microsoft.com/office/drawing/2016/5/13/chartex" xmlns:cx8="http://schemas.microsoft.com/office/drawing/2016/5/14/chartex" xmlns:mc="http://schemas.openxmlformats.org/markup-compatibility/2006" xmlns:aink="http://schemas.microsoft.com/office/drawing/2016/ink" xmlns:am3d="http://schemas.microsoft.com/office/drawing/2017/model3d" xmlns:o="urn:schemas-microsoft-com:office:office" xmlns:oel="http://schemas.microsoft.com/office/2019/extlst" xmlns:r="http://schemas.openxmlformats.org/officeDocument/2006/relationships" xmlns:m="http://schemas.openxmlformats.org/officeDocument/2006/math" xmlns:v="urn:schemas-microsoft-com:vml" xmlns:wp14="http://schemas.microsoft.com/office/word/2010/wordprocessingDrawing" xmlns:wp="http://schemas.openxmlformats.org/drawingml/2006/wordprocessingDrawing" xmlns:w10="urn:schemas-microsoft-com:office:word" xmlns:w="http://schemas.openxmlformats.org/wordprocessingml/2006/main" xmlns:w14="http://schemas.microsoft.com/office/word/2010/wordml" xmlns:w15="http://schemas.microsoft.com/office/word/2012/wordml" xmlns:w16cex="http://schemas.microsoft.com/office/word/2018/wordml/cex" xmlns:w16cid="http://schemas.microsoft.com/office/word/2016/wordml/cid" xmlns:w16="http://schemas.microsoft.com/office/word/2018/wordml" xmlns:w16du="http://schemas.microsoft.com/office/word/2023/wordml/word16du" xmlns:w16sdtdh="http://schemas.microsoft.com/office/word/2020/wordml/sdtdatahash" xmlns:w16sdtfl="http://schemas.microsoft.com/office/word/2024/wordml/sdtformatlock" xmlns:w16se="http://schemas.microsoft.com/office/word/2015/wordml/symex" xmlns:wpg="http://schemas.microsoft.com/office/word/2010/wordprocessingGroup" xmlns:wpi="http://schemas.microsoft.com/office/word/2010/wordprocessingInk" xmlns:wne="http://schemas.microsoft.com/office/word/2006/wordml" xmlns:wps="http://schemas.microsoft.com/office/word/2010/wordprocessingShape" mc:Ignorable="w14 w15 w16se w16cid w16 w16cex w16sdtdh w16sdtfl w16du wp14">
   <w:p>
     <w:pPr>
       <w:pStyle w:val="Cabealho"/>
@@ -1733,7 +1414,7 @@
 </file>
 
 <file path=word/header3.xml><?xml version="1.0" encoding="utf-8"?>
-<w:hdr xmlns:wpc="http://schemas.microsoft.com/office/word/2010/wordprocessingCanvas" xmlns:cx="http://schemas.microsoft.com/office/drawing/2014/chartex" xmlns:cx1="http://schemas.microsoft.com/office/drawing/2015/9/8/chartex" xmlns:cx2="http://schemas.microsoft.com/office/drawing/2015/10/21/chartex" xmlns:cx3="http://schemas.microsoft.com/office/drawing/2016/5/9/chartex" xmlns:cx4="http://schemas.microsoft.com/office/drawing/2016/5/10/chartex" xmlns:cx5="http://schemas.microsoft.com/office/drawing/2016/5/11/chartex" xmlns:cx6="http://schemas.microsoft.com/office/drawing/2016/5/12/chartex" xmlns:cx7="http://schemas.microsoft.com/office/drawing/2016/5/13/chartex" xmlns:cx8="http://schemas.microsoft.com/office/drawing/2016/5/14/chartex" xmlns:mc="http://schemas.openxmlformats.org/markup-compatibility/2006" xmlns:aink="http://schemas.microsoft.com/office/drawing/2016/ink" xmlns:am3d="http://schemas.microsoft.com/office/drawing/2017/model3d" xmlns:o="urn:schemas-microsoft-com:office:office" xmlns:oel="http://schemas.microsoft.com/office/2019/extlst" xmlns:r="http://schemas.openxmlformats.org/officeDocument/2006/relationships" xmlns:m="http://schemas.openxmlformats.org/officeDocument/2006/math" xmlns:v="urn:schemas-microsoft-com:vml" xmlns:wp14="http://schemas.microsoft.com/office/word/2010/wordprocessingDrawing" xmlns:wp="http://schemas.openxmlformats.org/drawingml/2006/wordprocessingDrawing" xmlns:w10="urn:schemas-microsoft-com:office:word" xmlns:w="http://schemas.openxmlformats.org/wordprocessingml/2006/main" xmlns:w14="http://schemas.microsoft.com/office/word/2010/wordml" xmlns:w15="http://schemas.microsoft.com/office/word/2012/wordml" xmlns:w16cex="http://schemas.microsoft.com/office/word/2018/wordml/cex" xmlns:w16cid="http://schemas.microsoft.com/office/word/2016/wordml/cid" xmlns:w16="http://schemas.microsoft.com/office/word/2018/wordml" xmlns:w16sdtdh="http://schemas.microsoft.com/office/word/2020/wordml/sdtdatahash" xmlns:w16se="http://schemas.microsoft.com/office/word/2015/wordml/symex" xmlns:wpg="http://schemas.microsoft.com/office/word/2010/wordprocessingGroup" xmlns:wpi="http://schemas.microsoft.com/office/word/2010/wordprocessingInk" xmlns:wne="http://schemas.microsoft.com/office/word/2006/wordml" xmlns:wps="http://schemas.microsoft.com/office/word/2010/wordprocessingShape" mc:Ignorable="w14 w15 w16se w16cid w16 w16cex w16sdtdh wp14">
+<w:hdr xmlns:wpc="http://schemas.microsoft.com/office/word/2010/wordprocessingCanvas" xmlns:cx="http://schemas.microsoft.com/office/drawing/2014/chartex" xmlns:cx1="http://schemas.microsoft.com/office/drawing/2015/9/8/chartex" xmlns:cx2="http://schemas.microsoft.com/office/drawing/2015/10/21/chartex" xmlns:cx3="http://schemas.microsoft.com/office/drawing/2016/5/9/chartex" xmlns:cx4="http://schemas.microsoft.com/office/drawing/2016/5/10/chartex" xmlns:cx5="http://schemas.microsoft.com/office/drawing/2016/5/11/chartex" xmlns:cx6="http://schemas.microsoft.com/office/drawing/2016/5/12/chartex" xmlns:cx7="http://schemas.microsoft.com/office/drawing/2016/5/13/chartex" xmlns:cx8="http://schemas.microsoft.com/office/drawing/2016/5/14/chartex" xmlns:mc="http://schemas.openxmlformats.org/markup-compatibility/2006" xmlns:aink="http://schemas.microsoft.com/office/drawing/2016/ink" xmlns:am3d="http://schemas.microsoft.com/office/drawing/2017/model3d" xmlns:o="urn:schemas-microsoft-com:office:office" xmlns:oel="http://schemas.microsoft.com/office/2019/extlst" xmlns:r="http://schemas.openxmlformats.org/officeDocument/2006/relationships" xmlns:m="http://schemas.openxmlformats.org/officeDocument/2006/math" xmlns:v="urn:schemas-microsoft-com:vml" xmlns:wp14="http://schemas.microsoft.com/office/word/2010/wordprocessingDrawing" xmlns:wp="http://schemas.openxmlformats.org/drawingml/2006/wordprocessingDrawing" xmlns:w10="urn:schemas-microsoft-com:office:word" xmlns:w="http://schemas.openxmlformats.org/wordprocessingml/2006/main" xmlns:w14="http://schemas.microsoft.com/office/word/2010/wordml" xmlns:w15="http://schemas.microsoft.com/office/word/2012/wordml" xmlns:w16cex="http://schemas.microsoft.com/office/word/2018/wordml/cex" xmlns:w16cid="http://schemas.microsoft.com/office/word/2016/wordml/cid" xmlns:w16="http://schemas.microsoft.com/office/word/2018/wordml" xmlns:w16du="http://schemas.microsoft.com/office/word/2023/wordml/word16du" xmlns:w16sdtdh="http://schemas.microsoft.com/office/word/2020/wordml/sdtdatahash" xmlns:w16sdtfl="http://schemas.microsoft.com/office/word/2024/wordml/sdtformatlock" xmlns:w16se="http://schemas.microsoft.com/office/word/2015/wordml/symex" xmlns:wpg="http://schemas.microsoft.com/office/word/2010/wordprocessingGroup" xmlns:wpi="http://schemas.microsoft.com/office/word/2010/wordprocessingInk" xmlns:wne="http://schemas.microsoft.com/office/word/2006/wordml" xmlns:wps="http://schemas.microsoft.com/office/word/2010/wordprocessingShape" mc:Ignorable="w14 w15 w16se w16cid w16 w16cex w16sdtdh w16sdtfl w16du wp14">
   <w:p>
     <w:pPr>
       <w:pStyle w:val="Cabealho"/>
@@ -1773,7 +1454,7 @@
 </file>
 
 <file path=word/numbering.xml><?xml version="1.0" encoding="utf-8"?>
-<w:numbering xmlns:wpc="http://schemas.microsoft.com/office/word/2010/wordprocessingCanvas" xmlns:cx="http://schemas.microsoft.com/office/drawing/2014/chartex" xmlns:cx1="http://schemas.microsoft.com/office/drawing/2015/9/8/chartex" xmlns:cx2="http://schemas.microsoft.com/office/drawing/2015/10/21/chartex" xmlns:cx3="http://schemas.microsoft.com/office/drawing/2016/5/9/chartex" xmlns:cx4="http://schemas.microsoft.com/office/drawing/2016/5/10/chartex" xmlns:cx5="http://schemas.microsoft.com/office/drawing/2016/5/11/chartex" xmlns:cx6="http://schemas.microsoft.com/office/drawing/2016/5/12/chartex" xmlns:cx7="http://schemas.microsoft.com/office/drawing/2016/5/13/chartex" xmlns:cx8="http://schemas.microsoft.com/office/drawing/2016/5/14/chartex" xmlns:mc="http://schemas.openxmlformats.org/markup-compatibility/2006" xmlns:aink="http://schemas.microsoft.com/office/drawing/2016/ink" xmlns:am3d="http://schemas.microsoft.com/office/drawing/2017/model3d" xmlns:o="urn:schemas-microsoft-com:office:office" xmlns:oel="http://schemas.microsoft.com/office/2019/extlst" xmlns:r="http://schemas.openxmlformats.org/officeDocument/2006/relationships" xmlns:m="http://schemas.openxmlformats.org/officeDocument/2006/math" xmlns:v="urn:schemas-microsoft-com:vml" xmlns:wp14="http://schemas.microsoft.com/office/word/2010/wordprocessingDrawing" xmlns:wp="http://schemas.openxmlformats.org/drawingml/2006/wordprocessingDrawing" xmlns:w10="urn:schemas-microsoft-com:office:word" xmlns:w="http://schemas.openxmlformats.org/wordprocessingml/2006/main" xmlns:w14="http://schemas.microsoft.com/office/word/2010/wordml" xmlns:w15="http://schemas.microsoft.com/office/word/2012/wordml" xmlns:w16cex="http://schemas.microsoft.com/office/word/2018/wordml/cex" xmlns:w16cid="http://schemas.microsoft.com/office/word/2016/wordml/cid" xmlns:w16="http://schemas.microsoft.com/office/word/2018/wordml" xmlns:w16sdtdh="http://schemas.microsoft.com/office/word/2020/wordml/sdtdatahash" xmlns:w16se="http://schemas.microsoft.com/office/word/2015/wordml/symex" xmlns:wpg="http://schemas.microsoft.com/office/word/2010/wordprocessingGroup" xmlns:wpi="http://schemas.microsoft.com/office/word/2010/wordprocessingInk" xmlns:wne="http://schemas.microsoft.com/office/word/2006/wordml" xmlns:wps="http://schemas.microsoft.com/office/word/2010/wordprocessingShape" mc:Ignorable="w14 w15 w16se w16cid w16 w16cex w16sdtdh wp14">
+<w:numbering xmlns:wpc="http://schemas.microsoft.com/office/word/2010/wordprocessingCanvas" xmlns:cx="http://schemas.microsoft.com/office/drawing/2014/chartex" xmlns:cx1="http://schemas.microsoft.com/office/drawing/2015/9/8/chartex" xmlns:cx2="http://schemas.microsoft.com/office/drawing/2015/10/21/chartex" xmlns:cx3="http://schemas.microsoft.com/office/drawing/2016/5/9/chartex" xmlns:cx4="http://schemas.microsoft.com/office/drawing/2016/5/10/chartex" xmlns:cx5="http://schemas.microsoft.com/office/drawing/2016/5/11/chartex" xmlns:cx6="http://schemas.microsoft.com/office/drawing/2016/5/12/chartex" xmlns:cx7="http://schemas.microsoft.com/office/drawing/2016/5/13/chartex" xmlns:cx8="http://schemas.microsoft.com/office/drawing/2016/5/14/chartex" xmlns:mc="http://schemas.openxmlformats.org/markup-compatibility/2006" xmlns:aink="http://schemas.microsoft.com/office/drawing/2016/ink" xmlns:am3d="http://schemas.microsoft.com/office/drawing/2017/model3d" xmlns:o="urn:schemas-microsoft-com:office:office" xmlns:oel="http://schemas.microsoft.com/office/2019/extlst" xmlns:r="http://schemas.openxmlformats.org/officeDocument/2006/relationships" xmlns:m="http://schemas.openxmlformats.org/officeDocument/2006/math" xmlns:v="urn:schemas-microsoft-com:vml" xmlns:wp14="http://schemas.microsoft.com/office/word/2010/wordprocessingDrawing" xmlns:wp="http://schemas.openxmlformats.org/drawingml/2006/wordprocessingDrawing" xmlns:w10="urn:schemas-microsoft-com:office:word" xmlns:w="http://schemas.openxmlformats.org/wordprocessingml/2006/main" xmlns:w14="http://schemas.microsoft.com/office/word/2010/wordml" xmlns:w15="http://schemas.microsoft.com/office/word/2012/wordml" xmlns:w16cex="http://schemas.microsoft.com/office/word/2018/wordml/cex" xmlns:w16cid="http://schemas.microsoft.com/office/word/2016/wordml/cid" xmlns:w16="http://schemas.microsoft.com/office/word/2018/wordml" xmlns:w16du="http://schemas.microsoft.com/office/word/2023/wordml/word16du" xmlns:w16sdtdh="http://schemas.microsoft.com/office/word/2020/wordml/sdtdatahash" xmlns:w16sdtfl="http://schemas.microsoft.com/office/word/2024/wordml/sdtformatlock" xmlns:w16se="http://schemas.microsoft.com/office/word/2015/wordml/symex" xmlns:wpg="http://schemas.microsoft.com/office/word/2010/wordprocessingGroup" xmlns:wpi="http://schemas.microsoft.com/office/word/2010/wordprocessingInk" xmlns:wne="http://schemas.microsoft.com/office/word/2006/wordml" xmlns:wps="http://schemas.microsoft.com/office/word/2010/wordprocessingShape" mc:Ignorable="w14 w15 w16se w16cid w16 w16cex w16sdtdh w16sdtfl w16du wp14">
   <w:abstractNum w:abstractNumId="0" w15:restartNumberingAfterBreak="0">
     <w:nsid w:val="07BD7C80"/>
     <w:multiLevelType w:val="multilevel"/>
@@ -2111,7 +1792,7 @@
 </file>
 
 <file path=word/styles.xml><?xml version="1.0" encoding="utf-8"?>
-<w:styles xmlns:mc="http://schemas.openxmlformats.org/markup-compatibility/2006" xmlns:r="http://schemas.openxmlformats.org/officeDocument/2006/relationships" xmlns:w="http://schemas.openxmlformats.org/wordprocessingml/2006/main" xmlns:w14="http://schemas.microsoft.com/office/word/2010/wordml" xmlns:w15="http://schemas.microsoft.com/office/word/2012/wordml" xmlns:w16cex="http://schemas.microsoft.com/office/word/2018/wordml/cex" xmlns:w16cid="http://schemas.microsoft.com/office/word/2016/wordml/cid" xmlns:w16="http://schemas.microsoft.com/office/word/2018/wordml" xmlns:w16sdtdh="http://schemas.microsoft.com/office/word/2020/wordml/sdtdatahash" xmlns:w16se="http://schemas.microsoft.com/office/word/2015/wordml/symex" mc:Ignorable="w14 w15 w16se w16cid w16 w16cex w16sdtdh">
+<w:styles xmlns:mc="http://schemas.openxmlformats.org/markup-compatibility/2006" xmlns:r="http://schemas.openxmlformats.org/officeDocument/2006/relationships" xmlns:w="http://schemas.openxmlformats.org/wordprocessingml/2006/main" xmlns:w14="http://schemas.microsoft.com/office/word/2010/wordml" xmlns:w15="http://schemas.microsoft.com/office/word/2012/wordml" xmlns:w16cex="http://schemas.microsoft.com/office/word/2018/wordml/cex" xmlns:w16cid="http://schemas.microsoft.com/office/word/2016/wordml/cid" xmlns:w16="http://schemas.microsoft.com/office/word/2018/wordml" xmlns:w16du="http://schemas.microsoft.com/office/word/2023/wordml/word16du" xmlns:w16sdtdh="http://schemas.microsoft.com/office/word/2020/wordml/sdtdatahash" xmlns:w16sdtfl="http://schemas.microsoft.com/office/word/2024/wordml/sdtformatlock" xmlns:w16se="http://schemas.microsoft.com/office/word/2015/wordml/symex" mc:Ignorable="w14 w15 w16se w16cid w16 w16cex w16sdtdh w16sdtfl w16du">
   <w:docDefaults>
     <w:rPrDefault>
       <w:rPr>

</xml_diff>